<commit_message>
Demande aux TI : déploiement pour le 9 novembre, revue de l'application et des groupes de sécurité
Co-Authored-By: Claude Opus 5.5 <noreply@anthropic.com>
Claude-Session: https://claude.ai/code/session_01FRdAzq8p3F9gJJe5MA3G79
</commit_message>
<xml_diff>
--- a/powerapps/transmission-TI/BORDEREAU-TRANSMISSION-TI.docx
+++ b/powerapps/transmission-TI/BORDEREAU-TRANSMISSION-TI.docx
@@ -701,19 +701,27 @@
               <w:jc w:val="left"/>
             </w:pPr>
             <w:r>
-              <w:t xml:space="preserve">BORDEREAU-TRANSMISSION-TI.docx</w:t>
-            </w:r>
-          </w:p>
-        </w:tc>
-        <w:tc>
-          <w:tcPr/>
-          <w:p>
-            <w:pPr>
-              <w:pStyle w:val="Compact"/>
-              <w:jc w:val="left"/>
-            </w:pPr>
-            <w:r>
-              <w:t xml:space="preserve">Ce document</w:t>
+              <w:rPr>
+                <w:bCs/>
+                <w:b/>
+              </w:rPr>
+              <w:t xml:space="preserve">DEMANDE-TI-DEPLOIEMENT-9-NOVEMBRE.docx</w:t>
+            </w:r>
+          </w:p>
+        </w:tc>
+        <w:tc>
+          <w:tcPr/>
+          <w:p>
+            <w:pPr>
+              <w:pStyle w:val="Compact"/>
+              <w:jc w:val="left"/>
+            </w:pPr>
+            <w:r>
+              <w:rPr>
+                <w:bCs/>
+                <w:b/>
+              </w:rPr>
+              <w:t xml:space="preserve">La demande : PréProd et Prod, revue de l’application, groupes de sécurité, recommandations, échéancier du 9 novembre</w:t>
             </w:r>
           </w:p>
         </w:tc>
@@ -739,19 +747,19 @@
               <w:jc w:val="left"/>
             </w:pPr>
             <w:r>
-              <w:t xml:space="preserve">DOSSIER-AUTORISATION-TI.docx</w:t>
-            </w:r>
-          </w:p>
-        </w:tc>
-        <w:tc>
-          <w:tcPr/>
-          <w:p>
-            <w:pPr>
-              <w:pStyle w:val="Compact"/>
-              <w:jc w:val="left"/>
-            </w:pPr>
-            <w:r>
-              <w:t xml:space="preserve">Réponses au formulaire des TI : texte « Commentaires », testeurs, renseignements personnels</w:t>
+              <w:t xml:space="preserve">BORDEREAU-TRANSMISSION-TI.docx</w:t>
+            </w:r>
+          </w:p>
+        </w:tc>
+        <w:tc>
+          <w:tcPr/>
+          <w:p>
+            <w:pPr>
+              <w:pStyle w:val="Compact"/>
+              <w:jc w:val="left"/>
+            </w:pPr>
+            <w:r>
+              <w:t xml:space="preserve">Ce document</w:t>
             </w:r>
           </w:p>
         </w:tc>
@@ -777,19 +785,19 @@
               <w:jc w:val="left"/>
             </w:pPr>
             <w:r>
-              <w:t xml:space="preserve">GUIDE-MISE-EN-PRODUCTION.docx</w:t>
-            </w:r>
-          </w:p>
-        </w:tc>
-        <w:tc>
-          <w:tcPr/>
-          <w:p>
-            <w:pPr>
-              <w:pStyle w:val="Compact"/>
-              <w:jc w:val="left"/>
-            </w:pPr>
-            <w:r>
-              <w:t xml:space="preserve">Guide technique : SharePoint (partie 4), flux (partie 6), tests (partie 8), remise (partie 9)</w:t>
+              <w:t xml:space="preserve">DOSSIER-AUTORISATION-TI.docx</w:t>
+            </w:r>
+          </w:p>
+        </w:tc>
+        <w:tc>
+          <w:tcPr/>
+          <w:p>
+            <w:pPr>
+              <w:pStyle w:val="Compact"/>
+              <w:jc w:val="left"/>
+            </w:pPr>
+            <w:r>
+              <w:t xml:space="preserve">Réponses au formulaire des TI : texte « Commentaires », testeurs, renseignements personnels</w:t>
             </w:r>
           </w:p>
         </w:tc>
@@ -815,19 +823,19 @@
               <w:jc w:val="left"/>
             </w:pPr>
             <w:r>
-              <w:t xml:space="preserve">Variables-environnement-et-deploiement.xlsx</w:t>
-            </w:r>
-          </w:p>
-        </w:tc>
-        <w:tc>
-          <w:tcPr/>
-          <w:p>
-            <w:pPr>
-              <w:pStyle w:val="Compact"/>
-              <w:jc w:val="left"/>
-            </w:pPr>
-            <w:r>
-              <w:t xml:space="preserve">Variables, SharePoint, composants, checklist TI, testeurs</w:t>
+              <w:t xml:space="preserve">GUIDE-MISE-EN-PRODUCTION.docx</w:t>
+            </w:r>
+          </w:p>
+        </w:tc>
+        <w:tc>
+          <w:tcPr/>
+          <w:p>
+            <w:pPr>
+              <w:pStyle w:val="Compact"/>
+              <w:jc w:val="left"/>
+            </w:pPr>
+            <w:r>
+              <w:t xml:space="preserve">Guide technique : SharePoint (partie 4), flux (partie 6), tests (partie 8), remise (partie 9)</w:t>
             </w:r>
           </w:p>
         </w:tc>
@@ -853,19 +861,19 @@
               <w:jc w:val="left"/>
             </w:pPr>
             <w:r>
-              <w:t xml:space="preserve">FLUX-FINAUX.txt</w:t>
-            </w:r>
-          </w:p>
-        </w:tc>
-        <w:tc>
-          <w:tcPr/>
-          <w:p>
-            <w:pPr>
-              <w:pStyle w:val="Compact"/>
-              <w:jc w:val="left"/>
-            </w:pPr>
-            <w:r>
-              <w:t xml:space="preserve">Les 3 flux, action par action</w:t>
+              <w:t xml:space="preserve">Variables-environnement-et-deploiement.xlsx</w:t>
+            </w:r>
+          </w:p>
+        </w:tc>
+        <w:tc>
+          <w:tcPr/>
+          <w:p>
+            <w:pPr>
+              <w:pStyle w:val="Compact"/>
+              <w:jc w:val="left"/>
+            </w:pPr>
+            <w:r>
+              <w:t xml:space="preserve">Variables, SharePoint, composants, checklist TI, testeurs</w:t>
             </w:r>
           </w:p>
         </w:tc>
@@ -880,6 +888,44 @@
             </w:pPr>
             <w:r>
               <w:t xml:space="preserve">7</w:t>
+            </w:r>
+          </w:p>
+        </w:tc>
+        <w:tc>
+          <w:tcPr/>
+          <w:p>
+            <w:pPr>
+              <w:pStyle w:val="Compact"/>
+              <w:jc w:val="left"/>
+            </w:pPr>
+            <w:r>
+              <w:t xml:space="preserve">FLUX-FINAUX.txt</w:t>
+            </w:r>
+          </w:p>
+        </w:tc>
+        <w:tc>
+          <w:tcPr/>
+          <w:p>
+            <w:pPr>
+              <w:pStyle w:val="Compact"/>
+              <w:jc w:val="left"/>
+            </w:pPr>
+            <w:r>
+              <w:t xml:space="preserve">Les 3 flux, action par action</w:t>
+            </w:r>
+          </w:p>
+        </w:tc>
+      </w:tr>
+      <w:tr>
+        <w:tc>
+          <w:tcPr/>
+          <w:p>
+            <w:pPr>
+              <w:pStyle w:val="Compact"/>
+              <w:jc w:val="left"/>
+            </w:pPr>
+            <w:r>
+              <w:t xml:space="preserve">8</w:t>
             </w:r>
           </w:p>
         </w:tc>
@@ -1185,7 +1231,7 @@
         <w:t xml:space="preserve"> </w:t>
       </w:r>
       <w:r>
-        <w:t xml:space="preserve">Demande de mise en PréProd — application Appréciation de la contribution (RH-SST)</w:t>
+        <w:t xml:space="preserve">Demande de déploiement pour le 9 novembre — application Appréciation de la contribution (RH-SST)</w:t>
       </w:r>
     </w:p>
     <w:p>
@@ -1201,23 +1247,7 @@
         <w:pStyle w:val="BlockText"/>
       </w:pPr>
       <w:r>
-        <w:t xml:space="preserve">Je vous transmets la demande de mise en</w:t>
-      </w:r>
-      <w:r>
-        <w:t xml:space="preserve"> </w:t>
-      </w:r>
-      <w:r>
-        <w:rPr>
-          <w:bCs/>
-          <w:b/>
-        </w:rPr>
-        <w:t xml:space="preserve">PréProd</w:t>
-      </w:r>
-      <w:r>
-        <w:t xml:space="preserve"> </w:t>
-      </w:r>
-      <w:r>
-        <w:t xml:space="preserve">de la solution</w:t>
+        <w:t xml:space="preserve">Je vous transmets la demande de déploiement de la solution</w:t>
       </w:r>
       <w:r>
         <w:t xml:space="preserve"> </w:t>
@@ -1233,7 +1263,109 @@
         <w:t xml:space="preserve"> </w:t>
       </w:r>
       <w:r>
-        <w:t xml:space="preserve">(version 1.0.0.2, gérée), qui remplace le formulaire Word d’appréciation de la contribution par une application Power Apps.</w:t>
+        <w:t xml:space="preserve">(version 1.0.0.2, gérée). Elle remplace le formulaire Word d’appréciation de la contribution par une application Power Apps qui sera utilisée par</w:t>
+      </w:r>
+      <w:r>
+        <w:t xml:space="preserve"> </w:t>
+      </w:r>
+      <w:r>
+        <w:rPr>
+          <w:bCs/>
+          <w:b/>
+        </w:rPr>
+        <w:t xml:space="preserve">plus de 500 personnes</w:t>
+      </w:r>
+      <w:r>
+        <w:t xml:space="preserve">. Nous visons un lancement auprès des gestionnaires le</w:t>
+      </w:r>
+      <w:r>
+        <w:t xml:space="preserve"> </w:t>
+      </w:r>
+      <w:r>
+        <w:rPr>
+          <w:bCs/>
+          <w:b/>
+        </w:rPr>
+        <w:t xml:space="preserve">lundi 9 novembre</w:t>
+      </w:r>
+      <w:r>
+        <w:t xml:space="preserve">.</w:t>
+      </w:r>
+    </w:p>
+    <w:p>
+      <w:pPr>
+        <w:pStyle w:val="BlockText"/>
+      </w:pPr>
+      <w:r>
+        <w:t xml:space="preserve">En plus de la mise en PréProd puis en Prod, nous aimerions que votre équipe</w:t>
+      </w:r>
+      <w:r>
+        <w:t xml:space="preserve"> </w:t>
+      </w:r>
+      <w:r>
+        <w:rPr>
+          <w:bCs/>
+          <w:b/>
+        </w:rPr>
+        <w:t xml:space="preserve">fasse le tour de l’application</w:t>
+      </w:r>
+      <w:r>
+        <w:t xml:space="preserve">,</w:t>
+      </w:r>
+      <w:r>
+        <w:t xml:space="preserve"> </w:t>
+      </w:r>
+      <w:r>
+        <w:rPr>
+          <w:bCs/>
+          <w:b/>
+        </w:rPr>
+        <w:t xml:space="preserve">valide les groupes de sécurité</w:t>
+      </w:r>
+      <w:r>
+        <w:t xml:space="preserve"> </w:t>
+      </w:r>
+      <w:r>
+        <w:t xml:space="preserve">et nous fasse part de ses</w:t>
+      </w:r>
+      <w:r>
+        <w:t xml:space="preserve"> </w:t>
+      </w:r>
+      <w:r>
+        <w:rPr>
+          <w:bCs/>
+          <w:b/>
+        </w:rPr>
+        <w:t xml:space="preserve">recommandations</w:t>
+      </w:r>
+      <w:r>
+        <w:t xml:space="preserve">. Tout est expliqué dans le document</w:t>
+      </w:r>
+      <w:r>
+        <w:t xml:space="preserve"> </w:t>
+      </w:r>
+      <w:r>
+        <w:rPr>
+          <w:bCs/>
+          <w:b/>
+        </w:rPr>
+        <w:t xml:space="preserve">DEMANDE-TI-DEPLOIEMENT-9-NOVEMBRE.docx</w:t>
+      </w:r>
+      <w:r>
+        <w:t xml:space="preserve">, avec l’échéancier proposé et une grille de rétroaction. Je propose une rencontre de revue le</w:t>
+      </w:r>
+      <w:r>
+        <w:t xml:space="preserve"> </w:t>
+      </w:r>
+      <w:r>
+        <w:rPr>
+          <w:bCs/>
+          <w:b/>
+        </w:rPr>
+        <w:t xml:space="preserve">mardi 3 novembre</w:t>
+      </w:r>
+      <w:r>
+        <w:t xml:space="preserve">.</w:t>
       </w:r>
     </w:p>
     <w:p>
@@ -1258,6 +1390,12 @@
       </w:r>
       <w:r>
         <w:t xml:space="preserve">:</w:t>
+      </w:r>
+      <w:r>
+        <w:t xml:space="preserve"> </w:t>
+      </w:r>
+      <w:r>
+        <w:t xml:space="preserve">- la demande et l’échéancier ;</w:t>
       </w:r>
       <w:r>
         <w:t xml:space="preserve"> </w:t>

</xml_diff>